<commit_message>
docs: the two manifest source documents
KindsOfAggregateResources.md is new: the taxonomy of aggregate/compound
dataset patterns, with the five dimensions that discriminate them --
homogeneity, closure, accessibility, distribution, granularity.

The .docx carries the author's latest revision of the profile draft
(overview, requirements, conceptual model, and an RO-Crate section still
in progress).

Committing these makes demoExamples/README.md's link to the taxonomy
resolve, and gives CDIF-ManifestProfile202608.md its provenance.

Co-Authored-By: Claude Opus 5 <noreply@anthropic.com>
</commit_message>
<xml_diff>
--- a/docs/CDIF Manifest Profile-V1-smr.docx
+++ b/docs/CDIF Manifest Profile-V1-smr.docx
@@ -1,6 +1,6 @@
 
 <file path=word/document.xml><?xml version="1.0" encoding="utf-8"?>
-<w:document xmlns:wpc="http://schemas.microsoft.com/office/word/2010/wordprocessingCanvas" xmlns:cx="http://schemas.microsoft.com/office/drawing/2014/chartex" xmlns:cx1="http://schemas.microsoft.com/office/drawing/2015/9/8/chartex" xmlns:cx2="http://schemas.microsoft.com/office/drawing/2015/10/21/chartex" xmlns:cx3="http://schemas.microsoft.com/office/drawing/2016/5/9/chartex" xmlns:cx4="http://schemas.microsoft.com/office/drawing/2016/5/10/chartex" xmlns:cx5="http://schemas.microsoft.com/office/drawing/2016/5/11/chartex" xmlns:cx6="http://schemas.microsoft.com/office/drawing/2016/5/12/chartex" xmlns:cx7="http://schemas.microsoft.com/office/drawing/2016/5/13/chartex" xmlns:cx8="http://schemas.microsoft.com/office/drawing/2016/5/14/chartex" xmlns:mc="http://schemas.openxmlformats.org/markup-compatibility/2006" xmlns:aink="http://schemas.microsoft.com/office/drawing/2016/ink" xmlns:am3d="http://schemas.microsoft.com/office/drawing/2017/model3d" xmlns:o="urn:schemas-microsoft-com:office:office" xmlns:oel="http://schemas.microsoft.com/office/2019/extlst" xmlns:r="http://schemas.openxmlformats.org/officeDocument/2006/relationships" xmlns:m="http://schemas.openxmlformats.org/officeDocument/2006/math" xmlns:v="urn:schemas-microsoft-com:vml" xmlns:wp14="http://schemas.microsoft.com/office/word/2010/wordprocessingDrawing" xmlns:wp="http://schemas.openxmlformats.org/drawingml/2006/wordprocessingDrawing" xmlns:w10="urn:schemas-microsoft-com:office:word" xmlns:w="http://schemas.openxmlformats.org/wordprocessingml/2006/main" xmlns:w14="http://schemas.microsoft.com/office/word/2010/wordml" xmlns:w15="http://schemas.microsoft.com/office/word/2012/wordml" xmlns:w16cex="http://schemas.microsoft.com/office/word/2018/wordml/cex" xmlns:w16cid="http://schemas.microsoft.com/office/word/2016/wordml/cid" xmlns:w16="http://schemas.microsoft.com/office/word/2018/wordml" xmlns:w16du="http://schemas.microsoft.com/office/word/2023/wordml/word16du" xmlns:w16sdtdh="http://schemas.microsoft.com/office/word/2020/wordml/sdtdatahash" xmlns:w16sdtfl="http://schemas.microsoft.com/office/word/2024/wordml/sdtformatlock" xmlns:w16se="http://schemas.microsoft.com/office/word/2015/wordml/symex" xmlns:wpg="http://schemas.microsoft.com/office/word/2010/wordprocessingGroup" xmlns:wpi="http://schemas.microsoft.com/office/word/2010/wordprocessingInk" xmlns:wne="http://schemas.microsoft.com/office/word/2006/wordml" xmlns:wps="http://schemas.microsoft.com/office/word/2010/wordprocessingShape" mc:Ignorable="w14 w15 w16se w16cid w16 w16cex w16sdtdh w16sdtfl w16du wp14">
+<w:document xmlns:wpc="http://schemas.microsoft.com/office/word/2010/wordprocessingCanvas" xmlns:cx="http://schemas.microsoft.com/office/drawing/2014/chartex" xmlns:cx1="http://schemas.microsoft.com/office/drawing/2015/9/8/chartex" xmlns:cx2="http://schemas.microsoft.com/office/drawing/2015/10/21/chartex" xmlns:cx3="http://schemas.microsoft.com/office/drawing/2016/5/9/chartex" xmlns:cx4="http://schemas.microsoft.com/office/drawing/2016/5/10/chartex" xmlns:cx5="http://schemas.microsoft.com/office/drawing/2016/5/11/chartex" xmlns:cx6="http://schemas.microsoft.com/office/drawing/2016/5/12/chartex" xmlns:cx7="http://schemas.microsoft.com/office/drawing/2016/5/13/chartex" xmlns:cx8="http://schemas.microsoft.com/office/drawing/2016/5/14/chartex" xmlns:mc="http://schemas.openxmlformats.org/markup-compatibility/2006" xmlns:aink="http://schemas.microsoft.com/office/drawing/2016/ink" xmlns:am3d="http://schemas.microsoft.com/office/drawing/2017/model3d" xmlns:o="urn:schemas-microsoft-com:office:office" xmlns:oel="http://schemas.microsoft.com/office/2019/extlst" xmlns:r="http://schemas.openxmlformats.org/officeDocument/2006/relationships" xmlns:m="http://schemas.openxmlformats.org/officeDocument/2006/math" xmlns:v="urn:schemas-microsoft-com:vml" xmlns:wp14="http://schemas.microsoft.com/office/word/2010/wordprocessingDrawing" xmlns:wp="http://schemas.openxmlformats.org/drawingml/2006/wordprocessingDrawing" xmlns:w10="urn:schemas-microsoft-com:office:word" xmlns:w="http://schemas.openxmlformats.org/wordprocessingml/2006/main" xmlns:w14="http://schemas.microsoft.com/office/word/2010/wordml" xmlns:w15="http://schemas.microsoft.com/office/word/2012/wordml" xmlns:w16cei="http://schemas.microsoft.com/office/word/2026/wordml/cei" xmlns:w16cex="http://schemas.microsoft.com/office/word/2018/wordml/cex" xmlns:w16cid="http://schemas.microsoft.com/office/word/2016/wordml/cid" xmlns:w16="http://schemas.microsoft.com/office/word/2018/wordml" xmlns:w16du="http://schemas.microsoft.com/office/word/2023/wordml/word16du" xmlns:w16sdtdh="http://schemas.microsoft.com/office/word/2020/wordml/sdtdatahash" xmlns:w16sdtfl="http://schemas.microsoft.com/office/word/2024/wordml/sdtformatlock" xmlns:w16se="http://schemas.microsoft.com/office/word/2015/wordml/symex" xmlns:wpg="http://schemas.microsoft.com/office/word/2010/wordprocessingGroup" xmlns:wpi="http://schemas.microsoft.com/office/word/2010/wordprocessingInk" xmlns:wne="http://schemas.microsoft.com/office/word/2006/wordml" xmlns:wps="http://schemas.microsoft.com/office/word/2010/wordprocessingShape" mc:Ignorable="w14 w15 w16se w16cid w16 w16cex w16sdtdh w16sdtfl w16du wp14">
   <w:body>
     <w:p>
       <w:pPr>
@@ -31,7 +31,7 @@
     </w:p>
     <w:p>
       <w:r>
-        <w:t>Within the set of FAIR functions supported by the CDIF guidelines ius a practical need to construct packages of interdependent resources. FAIR does not directly address this need, but experience has shown that the interlinked nature of data and metadata resources demands that meaningful packages can be assembled for different purposes.</w:t>
+        <w:t>Within the set of FAIR functions supported by the CDIF guidelines is a practical need to construct packages of interdependent resources. FAIR does not directly address this need, but experience has shown that the interlinked nature of data and metadata resources demands that meaningful packages can be assembled for different purposes.</w:t>
       </w:r>
     </w:p>
     <w:p>
@@ -457,7 +457,7 @@
 </file>
 
 <file path=word/comments.xml><?xml version="1.0" encoding="utf-8"?>
-<w:comments xmlns:wpc="http://schemas.microsoft.com/office/word/2010/wordprocessingCanvas" xmlns:cx="http://schemas.microsoft.com/office/drawing/2014/chartex" xmlns:cx1="http://schemas.microsoft.com/office/drawing/2015/9/8/chartex" xmlns:cx2="http://schemas.microsoft.com/office/drawing/2015/10/21/chartex" xmlns:cx3="http://schemas.microsoft.com/office/drawing/2016/5/9/chartex" xmlns:cx4="http://schemas.microsoft.com/office/drawing/2016/5/10/chartex" xmlns:cx5="http://schemas.microsoft.com/office/drawing/2016/5/11/chartex" xmlns:cx6="http://schemas.microsoft.com/office/drawing/2016/5/12/chartex" xmlns:cx7="http://schemas.microsoft.com/office/drawing/2016/5/13/chartex" xmlns:cx8="http://schemas.microsoft.com/office/drawing/2016/5/14/chartex" xmlns:mc="http://schemas.openxmlformats.org/markup-compatibility/2006" xmlns:aink="http://schemas.microsoft.com/office/drawing/2016/ink" xmlns:am3d="http://schemas.microsoft.com/office/drawing/2017/model3d" xmlns:o="urn:schemas-microsoft-com:office:office" xmlns:oel="http://schemas.microsoft.com/office/2019/extlst" xmlns:r="http://schemas.openxmlformats.org/officeDocument/2006/relationships" xmlns:m="http://schemas.openxmlformats.org/officeDocument/2006/math" xmlns:v="urn:schemas-microsoft-com:vml" xmlns:wp14="http://schemas.microsoft.com/office/word/2010/wordprocessingDrawing" xmlns:wp="http://schemas.openxmlformats.org/drawingml/2006/wordprocessingDrawing" xmlns:w10="urn:schemas-microsoft-com:office:word" xmlns:w="http://schemas.openxmlformats.org/wordprocessingml/2006/main" xmlns:w14="http://schemas.microsoft.com/office/word/2010/wordml" xmlns:w15="http://schemas.microsoft.com/office/word/2012/wordml" xmlns:w16cex="http://schemas.microsoft.com/office/word/2018/wordml/cex" xmlns:w16cid="http://schemas.microsoft.com/office/word/2016/wordml/cid" xmlns:w16="http://schemas.microsoft.com/office/word/2018/wordml" xmlns:w16du="http://schemas.microsoft.com/office/word/2023/wordml/word16du" xmlns:w16sdtdh="http://schemas.microsoft.com/office/word/2020/wordml/sdtdatahash" xmlns:w16sdtfl="http://schemas.microsoft.com/office/word/2024/wordml/sdtformatlock" xmlns:w16se="http://schemas.microsoft.com/office/word/2015/wordml/symex" xmlns:wpg="http://schemas.microsoft.com/office/word/2010/wordprocessingGroup" xmlns:wpi="http://schemas.microsoft.com/office/word/2010/wordprocessingInk" xmlns:wne="http://schemas.microsoft.com/office/word/2006/wordml" xmlns:wps="http://schemas.microsoft.com/office/word/2010/wordprocessingShape" mc:Ignorable="w14 w15 w16se w16cid w16 w16cex w16sdtdh w16sdtfl w16du wp14">
+<w:comments xmlns:wpc="http://schemas.microsoft.com/office/word/2010/wordprocessingCanvas" xmlns:cx="http://schemas.microsoft.com/office/drawing/2014/chartex" xmlns:cx1="http://schemas.microsoft.com/office/drawing/2015/9/8/chartex" xmlns:cx2="http://schemas.microsoft.com/office/drawing/2015/10/21/chartex" xmlns:cx3="http://schemas.microsoft.com/office/drawing/2016/5/9/chartex" xmlns:cx4="http://schemas.microsoft.com/office/drawing/2016/5/10/chartex" xmlns:cx5="http://schemas.microsoft.com/office/drawing/2016/5/11/chartex" xmlns:cx6="http://schemas.microsoft.com/office/drawing/2016/5/12/chartex" xmlns:cx7="http://schemas.microsoft.com/office/drawing/2016/5/13/chartex" xmlns:cx8="http://schemas.microsoft.com/office/drawing/2016/5/14/chartex" xmlns:mc="http://schemas.openxmlformats.org/markup-compatibility/2006" xmlns:aink="http://schemas.microsoft.com/office/drawing/2016/ink" xmlns:am3d="http://schemas.microsoft.com/office/drawing/2017/model3d" xmlns:o="urn:schemas-microsoft-com:office:office" xmlns:oel="http://schemas.microsoft.com/office/2019/extlst" xmlns:r="http://schemas.openxmlformats.org/officeDocument/2006/relationships" xmlns:m="http://schemas.openxmlformats.org/officeDocument/2006/math" xmlns:v="urn:schemas-microsoft-com:vml" xmlns:wp14="http://schemas.microsoft.com/office/word/2010/wordprocessingDrawing" xmlns:wp="http://schemas.openxmlformats.org/drawingml/2006/wordprocessingDrawing" xmlns:w10="urn:schemas-microsoft-com:office:word" xmlns:w="http://schemas.openxmlformats.org/wordprocessingml/2006/main" xmlns:w14="http://schemas.microsoft.com/office/word/2010/wordml" xmlns:w15="http://schemas.microsoft.com/office/word/2012/wordml" xmlns:w16cei="http://schemas.microsoft.com/office/word/2026/wordml/cei" xmlns:w16cex="http://schemas.microsoft.com/office/word/2018/wordml/cex" xmlns:w16cid="http://schemas.microsoft.com/office/word/2016/wordml/cid" xmlns:w16="http://schemas.microsoft.com/office/word/2018/wordml" xmlns:w16du="http://schemas.microsoft.com/office/word/2023/wordml/word16du" xmlns:w16sdtdh="http://schemas.microsoft.com/office/word/2020/wordml/sdtdatahash" xmlns:w16sdtfl="http://schemas.microsoft.com/office/word/2024/wordml/sdtformatlock" xmlns:w16se="http://schemas.microsoft.com/office/word/2015/wordml/symex" xmlns:wpg="http://schemas.microsoft.com/office/word/2010/wordprocessingGroup" xmlns:wpi="http://schemas.microsoft.com/office/word/2010/wordprocessingInk" xmlns:wne="http://schemas.microsoft.com/office/word/2006/wordml" xmlns:wps="http://schemas.microsoft.com/office/word/2010/wordprocessingShape" mc:Ignorable="w14 w15 w16se w16cid w16 w16cex w16sdtdh w16sdtfl w16du wp14">
   <w:comment w:id="0" w:author="Stephen Richard" w:date="2026-04-23T11:20:00Z" w:initials="SR">
     <w:p>
       <w:pPr>
@@ -630,7 +630,7 @@
 </file>
 
 <file path=word/commentsExtended.xml><?xml version="1.0" encoding="utf-8"?>
-<w15:commentsEx xmlns:wpc="http://schemas.microsoft.com/office/word/2010/wordprocessingCanvas" xmlns:cx="http://schemas.microsoft.com/office/drawing/2014/chartex" xmlns:cx1="http://schemas.microsoft.com/office/drawing/2015/9/8/chartex" xmlns:cx2="http://schemas.microsoft.com/office/drawing/2015/10/21/chartex" xmlns:cx3="http://schemas.microsoft.com/office/drawing/2016/5/9/chartex" xmlns:cx4="http://schemas.microsoft.com/office/drawing/2016/5/10/chartex" xmlns:cx5="http://schemas.microsoft.com/office/drawing/2016/5/11/chartex" xmlns:cx6="http://schemas.microsoft.com/office/drawing/2016/5/12/chartex" xmlns:cx7="http://schemas.microsoft.com/office/drawing/2016/5/13/chartex" xmlns:cx8="http://schemas.microsoft.com/office/drawing/2016/5/14/chartex" xmlns:mc="http://schemas.openxmlformats.org/markup-compatibility/2006" xmlns:aink="http://schemas.microsoft.com/office/drawing/2016/ink" xmlns:am3d="http://schemas.microsoft.com/office/drawing/2017/model3d" xmlns:o="urn:schemas-microsoft-com:office:office" xmlns:oel="http://schemas.microsoft.com/office/2019/extlst" xmlns:r="http://schemas.openxmlformats.org/officeDocument/2006/relationships" xmlns:m="http://schemas.openxmlformats.org/officeDocument/2006/math" xmlns:v="urn:schemas-microsoft-com:vml" xmlns:wp14="http://schemas.microsoft.com/office/word/2010/wordprocessingDrawing" xmlns:wp="http://schemas.openxmlformats.org/drawingml/2006/wordprocessingDrawing" xmlns:w10="urn:schemas-microsoft-com:office:word" xmlns:w="http://schemas.openxmlformats.org/wordprocessingml/2006/main" xmlns:w14="http://schemas.microsoft.com/office/word/2010/wordml" xmlns:w15="http://schemas.microsoft.com/office/word/2012/wordml" xmlns:w16cex="http://schemas.microsoft.com/office/word/2018/wordml/cex" xmlns:w16cid="http://schemas.microsoft.com/office/word/2016/wordml/cid" xmlns:w16="http://schemas.microsoft.com/office/word/2018/wordml" xmlns:w16du="http://schemas.microsoft.com/office/word/2023/wordml/word16du" xmlns:w16sdtdh="http://schemas.microsoft.com/office/word/2020/wordml/sdtdatahash" xmlns:w16sdtfl="http://schemas.microsoft.com/office/word/2024/wordml/sdtformatlock" xmlns:w16se="http://schemas.microsoft.com/office/word/2015/wordml/symex" xmlns:wpg="http://schemas.microsoft.com/office/word/2010/wordprocessingGroup" xmlns:wpi="http://schemas.microsoft.com/office/word/2010/wordprocessingInk" xmlns:wne="http://schemas.microsoft.com/office/word/2006/wordml" xmlns:wps="http://schemas.microsoft.com/office/word/2010/wordprocessingShape" mc:Ignorable="w14 w15 w16se w16cid w16 w16cex w16sdtdh w16sdtfl w16du wp14">
+<w15:commentsEx xmlns:wpc="http://schemas.microsoft.com/office/word/2010/wordprocessingCanvas" xmlns:cx="http://schemas.microsoft.com/office/drawing/2014/chartex" xmlns:cx1="http://schemas.microsoft.com/office/drawing/2015/9/8/chartex" xmlns:cx2="http://schemas.microsoft.com/office/drawing/2015/10/21/chartex" xmlns:cx3="http://schemas.microsoft.com/office/drawing/2016/5/9/chartex" xmlns:cx4="http://schemas.microsoft.com/office/drawing/2016/5/10/chartex" xmlns:cx5="http://schemas.microsoft.com/office/drawing/2016/5/11/chartex" xmlns:cx6="http://schemas.microsoft.com/office/drawing/2016/5/12/chartex" xmlns:cx7="http://schemas.microsoft.com/office/drawing/2016/5/13/chartex" xmlns:cx8="http://schemas.microsoft.com/office/drawing/2016/5/14/chartex" xmlns:mc="http://schemas.openxmlformats.org/markup-compatibility/2006" xmlns:aink="http://schemas.microsoft.com/office/drawing/2016/ink" xmlns:am3d="http://schemas.microsoft.com/office/drawing/2017/model3d" xmlns:o="urn:schemas-microsoft-com:office:office" xmlns:oel="http://schemas.microsoft.com/office/2019/extlst" xmlns:r="http://schemas.openxmlformats.org/officeDocument/2006/relationships" xmlns:m="http://schemas.openxmlformats.org/officeDocument/2006/math" xmlns:v="urn:schemas-microsoft-com:vml" xmlns:wp14="http://schemas.microsoft.com/office/word/2010/wordprocessingDrawing" xmlns:wp="http://schemas.openxmlformats.org/drawingml/2006/wordprocessingDrawing" xmlns:w10="urn:schemas-microsoft-com:office:word" xmlns:w="http://schemas.openxmlformats.org/wordprocessingml/2006/main" xmlns:w14="http://schemas.microsoft.com/office/word/2010/wordml" xmlns:w15="http://schemas.microsoft.com/office/word/2012/wordml" xmlns:w16cei="http://schemas.microsoft.com/office/word/2026/wordml/cei" xmlns:w16cex="http://schemas.microsoft.com/office/word/2018/wordml/cex" xmlns:w16cid="http://schemas.microsoft.com/office/word/2016/wordml/cid" xmlns:w16="http://schemas.microsoft.com/office/word/2018/wordml" xmlns:w16du="http://schemas.microsoft.com/office/word/2023/wordml/word16du" xmlns:w16sdtdh="http://schemas.microsoft.com/office/word/2020/wordml/sdtdatahash" xmlns:w16sdtfl="http://schemas.microsoft.com/office/word/2024/wordml/sdtformatlock" xmlns:w16se="http://schemas.microsoft.com/office/word/2015/wordml/symex" xmlns:wpg="http://schemas.microsoft.com/office/word/2010/wordprocessingGroup" xmlns:wpi="http://schemas.microsoft.com/office/word/2010/wordprocessingInk" xmlns:wne="http://schemas.microsoft.com/office/word/2006/wordml" xmlns:wps="http://schemas.microsoft.com/office/word/2010/wordprocessingShape" mc:Ignorable="w14 w15 w16se w16cid w16 w16cex w16sdtdh w16sdtfl w16du wp14">
   <w15:commentEx w15:paraId="0C9FD2C9" w15:done="0"/>
   <w15:commentEx w15:paraId="7272A34C" w15:done="0"/>
   <w15:commentEx w15:paraId="73691D54" w15:done="0"/>
@@ -642,7 +642,7 @@
 </file>
 
 <file path=word/commentsExtensible.xml><?xml version="1.0" encoding="utf-8"?>
-<w16cex:commentsExtensible xmlns:wpc="http://schemas.microsoft.com/office/word/2010/wordprocessingCanvas" xmlns:cx="http://schemas.microsoft.com/office/drawing/2014/chartex" xmlns:cx1="http://schemas.microsoft.com/office/drawing/2015/9/8/chartex" xmlns:cx2="http://schemas.microsoft.com/office/drawing/2015/10/21/chartex" xmlns:cx3="http://schemas.microsoft.com/office/drawing/2016/5/9/chartex" xmlns:cx4="http://schemas.microsoft.com/office/drawing/2016/5/10/chartex" xmlns:cx5="http://schemas.microsoft.com/office/drawing/2016/5/11/chartex" xmlns:cx6="http://schemas.microsoft.com/office/drawing/2016/5/12/chartex" xmlns:cx7="http://schemas.microsoft.com/office/drawing/2016/5/13/chartex" xmlns:cx8="http://schemas.microsoft.com/office/drawing/2016/5/14/chartex" xmlns:cr="http://schemas.microsoft.com/office/comments/2020/reactions" xmlns:mc="http://schemas.openxmlformats.org/markup-compatibility/2006" xmlns:aink="http://schemas.microsoft.com/office/drawing/2016/ink" xmlns:am3d="http://schemas.microsoft.com/office/drawing/2017/model3d" xmlns:o="urn:schemas-microsoft-com:office:office" xmlns:oel="http://schemas.microsoft.com/office/2019/extlst" xmlns:r="http://schemas.openxmlformats.org/officeDocument/2006/relationships" xmlns:m="http://schemas.openxmlformats.org/officeDocument/2006/math" xmlns:v="urn:schemas-microsoft-com:vml" xmlns:wp14="http://schemas.microsoft.com/office/word/2010/wordprocessingDrawing" xmlns:wp="http://schemas.openxmlformats.org/drawingml/2006/wordprocessingDrawing" xmlns:w10="urn:schemas-microsoft-com:office:word" xmlns:w="http://schemas.openxmlformats.org/wordprocessingml/2006/main" xmlns:w14="http://schemas.microsoft.com/office/word/2010/wordml" xmlns:w15="http://schemas.microsoft.com/office/word/2012/wordml" xmlns:w16cex="http://schemas.microsoft.com/office/word/2018/wordml/cex" xmlns:w16cid="http://schemas.microsoft.com/office/word/2016/wordml/cid" xmlns:w16="http://schemas.microsoft.com/office/word/2018/wordml" xmlns:w16du="http://schemas.microsoft.com/office/word/2023/wordml/word16du" xmlns:w16sdtdh="http://schemas.microsoft.com/office/word/2020/wordml/sdtdatahash" xmlns:w16sdtfl="http://schemas.microsoft.com/office/word/2024/wordml/sdtformatlock" xmlns:w16se="http://schemas.microsoft.com/office/word/2015/wordml/symex" xmlns:wpg="http://schemas.microsoft.com/office/word/2010/wordprocessingGroup" xmlns:wpi="http://schemas.microsoft.com/office/word/2010/wordprocessingInk" xmlns:wne="http://schemas.microsoft.com/office/word/2006/wordml" xmlns:wps="http://schemas.microsoft.com/office/word/2010/wordprocessingShape" mc:Ignorable="w14 w15 w16se w16cid w16 w16cex w16sdtdh w16sdtfl cr w16du wp14">
+<w16cex:commentsExtensible xmlns:wpc="http://schemas.microsoft.com/office/word/2010/wordprocessingCanvas" xmlns:cx="http://schemas.microsoft.com/office/drawing/2014/chartex" xmlns:cx1="http://schemas.microsoft.com/office/drawing/2015/9/8/chartex" xmlns:cx2="http://schemas.microsoft.com/office/drawing/2015/10/21/chartex" xmlns:cx3="http://schemas.microsoft.com/office/drawing/2016/5/9/chartex" xmlns:cx4="http://schemas.microsoft.com/office/drawing/2016/5/10/chartex" xmlns:cx5="http://schemas.microsoft.com/office/drawing/2016/5/11/chartex" xmlns:cx6="http://schemas.microsoft.com/office/drawing/2016/5/12/chartex" xmlns:cx7="http://schemas.microsoft.com/office/drawing/2016/5/13/chartex" xmlns:cx8="http://schemas.microsoft.com/office/drawing/2016/5/14/chartex" xmlns:cr="http://schemas.microsoft.com/office/comments/2020/reactions" xmlns:mc="http://schemas.openxmlformats.org/markup-compatibility/2006" xmlns:aink="http://schemas.microsoft.com/office/drawing/2016/ink" xmlns:am3d="http://schemas.microsoft.com/office/drawing/2017/model3d" xmlns:o="urn:schemas-microsoft-com:office:office" xmlns:oel="http://schemas.microsoft.com/office/2019/extlst" xmlns:r="http://schemas.openxmlformats.org/officeDocument/2006/relationships" xmlns:m="http://schemas.openxmlformats.org/officeDocument/2006/math" xmlns:v="urn:schemas-microsoft-com:vml" xmlns:wp14="http://schemas.microsoft.com/office/word/2010/wordprocessingDrawing" xmlns:wp="http://schemas.openxmlformats.org/drawingml/2006/wordprocessingDrawing" xmlns:w10="urn:schemas-microsoft-com:office:word" xmlns:w="http://schemas.openxmlformats.org/wordprocessingml/2006/main" xmlns:w14="http://schemas.microsoft.com/office/word/2010/wordml" xmlns:w15="http://schemas.microsoft.com/office/word/2012/wordml" xmlns:w16cei="http://schemas.microsoft.com/office/word/2026/wordml/cei" xmlns:w16cex="http://schemas.microsoft.com/office/word/2018/wordml/cex" xmlns:w16cid="http://schemas.microsoft.com/office/word/2016/wordml/cid" xmlns:w16="http://schemas.microsoft.com/office/word/2018/wordml" xmlns:w16du="http://schemas.microsoft.com/office/word/2023/wordml/word16du" xmlns:w16sdtdh="http://schemas.microsoft.com/office/word/2020/wordml/sdtdatahash" xmlns:w16sdtfl="http://schemas.microsoft.com/office/word/2024/wordml/sdtformatlock" xmlns:w16se="http://schemas.microsoft.com/office/word/2015/wordml/symex" xmlns:wpg="http://schemas.microsoft.com/office/word/2010/wordprocessingGroup" xmlns:wpi="http://schemas.microsoft.com/office/word/2010/wordprocessingInk" xmlns:wne="http://schemas.microsoft.com/office/word/2006/wordml" xmlns:wps="http://schemas.microsoft.com/office/word/2010/wordprocessingShape" mc:Ignorable="w14 w15 w16se w16cid w16 w16cex w16sdtdh w16sdtfl cr w16du wp14">
   <w16cex:commentExtensible w16cex:durableId="1BBBE877" w16cex:dateUtc="2026-04-23T18:20:00Z"/>
   <w16cex:commentExtensible w16cex:durableId="7EBC135C" w16cex:dateUtc="2026-04-23T18:30:00Z"/>
   <w16cex:commentExtensible w16cex:durableId="076CB5DB" w16cex:dateUtc="2026-04-23T18:32:00Z"/>
@@ -654,7 +654,7 @@
 </file>
 
 <file path=word/commentsIds.xml><?xml version="1.0" encoding="utf-8"?>
-<w16cid:commentsIds xmlns:wpc="http://schemas.microsoft.com/office/word/2010/wordprocessingCanvas" xmlns:cx="http://schemas.microsoft.com/office/drawing/2014/chartex" xmlns:cx1="http://schemas.microsoft.com/office/drawing/2015/9/8/chartex" xmlns:cx2="http://schemas.microsoft.com/office/drawing/2015/10/21/chartex" xmlns:cx3="http://schemas.microsoft.com/office/drawing/2016/5/9/chartex" xmlns:cx4="http://schemas.microsoft.com/office/drawing/2016/5/10/chartex" xmlns:cx5="http://schemas.microsoft.com/office/drawing/2016/5/11/chartex" xmlns:cx6="http://schemas.microsoft.com/office/drawing/2016/5/12/chartex" xmlns:cx7="http://schemas.microsoft.com/office/drawing/2016/5/13/chartex" xmlns:cx8="http://schemas.microsoft.com/office/drawing/2016/5/14/chartex" xmlns:mc="http://schemas.openxmlformats.org/markup-compatibility/2006" xmlns:aink="http://schemas.microsoft.com/office/drawing/2016/ink" xmlns:am3d="http://schemas.microsoft.com/office/drawing/2017/model3d" xmlns:o="urn:schemas-microsoft-com:office:office" xmlns:oel="http://schemas.microsoft.com/office/2019/extlst" xmlns:r="http://schemas.openxmlformats.org/officeDocument/2006/relationships" xmlns:m="http://schemas.openxmlformats.org/officeDocument/2006/math" xmlns:v="urn:schemas-microsoft-com:vml" xmlns:wp14="http://schemas.microsoft.com/office/word/2010/wordprocessingDrawing" xmlns:wp="http://schemas.openxmlformats.org/drawingml/2006/wordprocessingDrawing" xmlns:w10="urn:schemas-microsoft-com:office:word" xmlns:w="http://schemas.openxmlformats.org/wordprocessingml/2006/main" xmlns:w14="http://schemas.microsoft.com/office/word/2010/wordml" xmlns:w15="http://schemas.microsoft.com/office/word/2012/wordml" xmlns:w16cex="http://schemas.microsoft.com/office/word/2018/wordml/cex" xmlns:w16cid="http://schemas.microsoft.com/office/word/2016/wordml/cid" xmlns:w16="http://schemas.microsoft.com/office/word/2018/wordml" xmlns:w16du="http://schemas.microsoft.com/office/word/2023/wordml/word16du" xmlns:w16sdtdh="http://schemas.microsoft.com/office/word/2020/wordml/sdtdatahash" xmlns:w16sdtfl="http://schemas.microsoft.com/office/word/2024/wordml/sdtformatlock" xmlns:w16se="http://schemas.microsoft.com/office/word/2015/wordml/symex" xmlns:wpg="http://schemas.microsoft.com/office/word/2010/wordprocessingGroup" xmlns:wpi="http://schemas.microsoft.com/office/word/2010/wordprocessingInk" xmlns:wne="http://schemas.microsoft.com/office/word/2006/wordml" xmlns:wps="http://schemas.microsoft.com/office/word/2010/wordprocessingShape" mc:Ignorable="w14 w15 w16se w16cid w16 w16cex w16sdtdh w16sdtfl w16du wp14">
+<w16cid:commentsIds xmlns:wpc="http://schemas.microsoft.com/office/word/2010/wordprocessingCanvas" xmlns:cx="http://schemas.microsoft.com/office/drawing/2014/chartex" xmlns:cx1="http://schemas.microsoft.com/office/drawing/2015/9/8/chartex" xmlns:cx2="http://schemas.microsoft.com/office/drawing/2015/10/21/chartex" xmlns:cx3="http://schemas.microsoft.com/office/drawing/2016/5/9/chartex" xmlns:cx4="http://schemas.microsoft.com/office/drawing/2016/5/10/chartex" xmlns:cx5="http://schemas.microsoft.com/office/drawing/2016/5/11/chartex" xmlns:cx6="http://schemas.microsoft.com/office/drawing/2016/5/12/chartex" xmlns:cx7="http://schemas.microsoft.com/office/drawing/2016/5/13/chartex" xmlns:cx8="http://schemas.microsoft.com/office/drawing/2016/5/14/chartex" xmlns:mc="http://schemas.openxmlformats.org/markup-compatibility/2006" xmlns:aink="http://schemas.microsoft.com/office/drawing/2016/ink" xmlns:am3d="http://schemas.microsoft.com/office/drawing/2017/model3d" xmlns:o="urn:schemas-microsoft-com:office:office" xmlns:oel="http://schemas.microsoft.com/office/2019/extlst" xmlns:r="http://schemas.openxmlformats.org/officeDocument/2006/relationships" xmlns:m="http://schemas.openxmlformats.org/officeDocument/2006/math" xmlns:v="urn:schemas-microsoft-com:vml" xmlns:wp14="http://schemas.microsoft.com/office/word/2010/wordprocessingDrawing" xmlns:wp="http://schemas.openxmlformats.org/drawingml/2006/wordprocessingDrawing" xmlns:w10="urn:schemas-microsoft-com:office:word" xmlns:w="http://schemas.openxmlformats.org/wordprocessingml/2006/main" xmlns:w14="http://schemas.microsoft.com/office/word/2010/wordml" xmlns:w15="http://schemas.microsoft.com/office/word/2012/wordml" xmlns:w16cei="http://schemas.microsoft.com/office/word/2026/wordml/cei" xmlns:w16cex="http://schemas.microsoft.com/office/word/2018/wordml/cex" xmlns:w16cid="http://schemas.microsoft.com/office/word/2016/wordml/cid" xmlns:w16="http://schemas.microsoft.com/office/word/2018/wordml" xmlns:w16du="http://schemas.microsoft.com/office/word/2023/wordml/word16du" xmlns:w16sdtdh="http://schemas.microsoft.com/office/word/2020/wordml/sdtdatahash" xmlns:w16sdtfl="http://schemas.microsoft.com/office/word/2024/wordml/sdtformatlock" xmlns:w16se="http://schemas.microsoft.com/office/word/2015/wordml/symex" xmlns:wpg="http://schemas.microsoft.com/office/word/2010/wordprocessingGroup" xmlns:wpi="http://schemas.microsoft.com/office/word/2010/wordprocessingInk" xmlns:wne="http://schemas.microsoft.com/office/word/2006/wordml" xmlns:wps="http://schemas.microsoft.com/office/word/2010/wordprocessingShape" mc:Ignorable="w14 w15 w16se w16cid w16 w16cex w16sdtdh w16sdtfl w16du wp14">
   <w16cid:commentId w16cid:paraId="0C9FD2C9" w16cid:durableId="1BBBE877"/>
   <w16cid:commentId w16cid:paraId="7272A34C" w16cid:durableId="7EBC135C"/>
   <w16cid:commentId w16cid:paraId="73691D54" w16cid:durableId="076CB5DB"/>
@@ -666,7 +666,7 @@
 </file>
 
 <file path=word/endnotes.xml><?xml version="1.0" encoding="utf-8"?>
-<w:endnotes xmlns:wpc="http://schemas.microsoft.com/office/word/2010/wordprocessingCanvas" xmlns:cx="http://schemas.microsoft.com/office/drawing/2014/chartex" xmlns:cx1="http://schemas.microsoft.com/office/drawing/2015/9/8/chartex" xmlns:cx2="http://schemas.microsoft.com/office/drawing/2015/10/21/chartex" xmlns:cx3="http://schemas.microsoft.com/office/drawing/2016/5/9/chartex" xmlns:cx4="http://schemas.microsoft.com/office/drawing/2016/5/10/chartex" xmlns:cx5="http://schemas.microsoft.com/office/drawing/2016/5/11/chartex" xmlns:cx6="http://schemas.microsoft.com/office/drawing/2016/5/12/chartex" xmlns:cx7="http://schemas.microsoft.com/office/drawing/2016/5/13/chartex" xmlns:cx8="http://schemas.microsoft.com/office/drawing/2016/5/14/chartex" xmlns:mc="http://schemas.openxmlformats.org/markup-compatibility/2006" xmlns:aink="http://schemas.microsoft.com/office/drawing/2016/ink" xmlns:am3d="http://schemas.microsoft.com/office/drawing/2017/model3d" xmlns:o="urn:schemas-microsoft-com:office:office" xmlns:oel="http://schemas.microsoft.com/office/2019/extlst" xmlns:r="http://schemas.openxmlformats.org/officeDocument/2006/relationships" xmlns:m="http://schemas.openxmlformats.org/officeDocument/2006/math" xmlns:v="urn:schemas-microsoft-com:vml" xmlns:wp14="http://schemas.microsoft.com/office/word/2010/wordprocessingDrawing" xmlns:wp="http://schemas.openxmlformats.org/drawingml/2006/wordprocessingDrawing" xmlns:w10="urn:schemas-microsoft-com:office:word" xmlns:w="http://schemas.openxmlformats.org/wordprocessingml/2006/main" xmlns:w14="http://schemas.microsoft.com/office/word/2010/wordml" xmlns:w15="http://schemas.microsoft.com/office/word/2012/wordml" xmlns:w16cex="http://schemas.microsoft.com/office/word/2018/wordml/cex" xmlns:w16cid="http://schemas.microsoft.com/office/word/2016/wordml/cid" xmlns:w16="http://schemas.microsoft.com/office/word/2018/wordml" xmlns:w16du="http://schemas.microsoft.com/office/word/2023/wordml/word16du" xmlns:w16sdtdh="http://schemas.microsoft.com/office/word/2020/wordml/sdtdatahash" xmlns:w16sdtfl="http://schemas.microsoft.com/office/word/2024/wordml/sdtformatlock" xmlns:w16se="http://schemas.microsoft.com/office/word/2015/wordml/symex" xmlns:wpg="http://schemas.microsoft.com/office/word/2010/wordprocessingGroup" xmlns:wpi="http://schemas.microsoft.com/office/word/2010/wordprocessingInk" xmlns:wne="http://schemas.microsoft.com/office/word/2006/wordml" xmlns:wps="http://schemas.microsoft.com/office/word/2010/wordprocessingShape" mc:Ignorable="w14 w15 w16se w16cid w16 w16cex w16sdtdh w16sdtfl w16du wp14">
+<w:endnotes xmlns:wpc="http://schemas.microsoft.com/office/word/2010/wordprocessingCanvas" xmlns:cx="http://schemas.microsoft.com/office/drawing/2014/chartex" xmlns:cx1="http://schemas.microsoft.com/office/drawing/2015/9/8/chartex" xmlns:cx2="http://schemas.microsoft.com/office/drawing/2015/10/21/chartex" xmlns:cx3="http://schemas.microsoft.com/office/drawing/2016/5/9/chartex" xmlns:cx4="http://schemas.microsoft.com/office/drawing/2016/5/10/chartex" xmlns:cx5="http://schemas.microsoft.com/office/drawing/2016/5/11/chartex" xmlns:cx6="http://schemas.microsoft.com/office/drawing/2016/5/12/chartex" xmlns:cx7="http://schemas.microsoft.com/office/drawing/2016/5/13/chartex" xmlns:cx8="http://schemas.microsoft.com/office/drawing/2016/5/14/chartex" xmlns:mc="http://schemas.openxmlformats.org/markup-compatibility/2006" xmlns:aink="http://schemas.microsoft.com/office/drawing/2016/ink" xmlns:am3d="http://schemas.microsoft.com/office/drawing/2017/model3d" xmlns:o="urn:schemas-microsoft-com:office:office" xmlns:oel="http://schemas.microsoft.com/office/2019/extlst" xmlns:r="http://schemas.openxmlformats.org/officeDocument/2006/relationships" xmlns:m="http://schemas.openxmlformats.org/officeDocument/2006/math" xmlns:v="urn:schemas-microsoft-com:vml" xmlns:wp14="http://schemas.microsoft.com/office/word/2010/wordprocessingDrawing" xmlns:wp="http://schemas.openxmlformats.org/drawingml/2006/wordprocessingDrawing" xmlns:w10="urn:schemas-microsoft-com:office:word" xmlns:w="http://schemas.openxmlformats.org/wordprocessingml/2006/main" xmlns:w14="http://schemas.microsoft.com/office/word/2010/wordml" xmlns:w15="http://schemas.microsoft.com/office/word/2012/wordml" xmlns:w16cei="http://schemas.microsoft.com/office/word/2026/wordml/cei" xmlns:w16cex="http://schemas.microsoft.com/office/word/2018/wordml/cex" xmlns:w16cid="http://schemas.microsoft.com/office/word/2016/wordml/cid" xmlns:w16="http://schemas.microsoft.com/office/word/2018/wordml" xmlns:w16du="http://schemas.microsoft.com/office/word/2023/wordml/word16du" xmlns:w16sdtdh="http://schemas.microsoft.com/office/word/2020/wordml/sdtdatahash" xmlns:w16sdtfl="http://schemas.microsoft.com/office/word/2024/wordml/sdtformatlock" xmlns:w16se="http://schemas.microsoft.com/office/word/2015/wordml/symex" xmlns:wpg="http://schemas.microsoft.com/office/word/2010/wordprocessingGroup" xmlns:wpi="http://schemas.microsoft.com/office/word/2010/wordprocessingInk" xmlns:wne="http://schemas.microsoft.com/office/word/2006/wordml" xmlns:wps="http://schemas.microsoft.com/office/word/2010/wordprocessingShape" mc:Ignorable="w14 w15 w16se w16cid w16 w16cex w16sdtdh w16sdtfl w16du wp14">
   <w:endnote w:type="separator" w:id="-1">
     <w:p>
       <w:pPr>
@@ -691,7 +691,7 @@
 </file>
 
 <file path=word/footer1.xml><?xml version="1.0" encoding="utf-8"?>
-<w:ftr xmlns:wpc="http://schemas.microsoft.com/office/word/2010/wordprocessingCanvas" xmlns:cx="http://schemas.microsoft.com/office/drawing/2014/chartex" xmlns:cx1="http://schemas.microsoft.com/office/drawing/2015/9/8/chartex" xmlns:cx2="http://schemas.microsoft.com/office/drawing/2015/10/21/chartex" xmlns:cx3="http://schemas.microsoft.com/office/drawing/2016/5/9/chartex" xmlns:cx4="http://schemas.microsoft.com/office/drawing/2016/5/10/chartex" xmlns:cx5="http://schemas.microsoft.com/office/drawing/2016/5/11/chartex" xmlns:cx6="http://schemas.microsoft.com/office/drawing/2016/5/12/chartex" xmlns:cx7="http://schemas.microsoft.com/office/drawing/2016/5/13/chartex" xmlns:cx8="http://schemas.microsoft.com/office/drawing/2016/5/14/chartex" xmlns:mc="http://schemas.openxmlformats.org/markup-compatibility/2006" xmlns:aink="http://schemas.microsoft.com/office/drawing/2016/ink" xmlns:am3d="http://schemas.microsoft.com/office/drawing/2017/model3d" xmlns:o="urn:schemas-microsoft-com:office:office" xmlns:oel="http://schemas.microsoft.com/office/2019/extlst" xmlns:r="http://schemas.openxmlformats.org/officeDocument/2006/relationships" xmlns:m="http://schemas.openxmlformats.org/officeDocument/2006/math" xmlns:v="urn:schemas-microsoft-com:vml" xmlns:wp14="http://schemas.microsoft.com/office/word/2010/wordprocessingDrawing" xmlns:wp="http://schemas.openxmlformats.org/drawingml/2006/wordprocessingDrawing" xmlns:w10="urn:schemas-microsoft-com:office:word" xmlns:w="http://schemas.openxmlformats.org/wordprocessingml/2006/main" xmlns:w14="http://schemas.microsoft.com/office/word/2010/wordml" xmlns:w15="http://schemas.microsoft.com/office/word/2012/wordml" xmlns:w16cex="http://schemas.microsoft.com/office/word/2018/wordml/cex" xmlns:w16cid="http://schemas.microsoft.com/office/word/2016/wordml/cid" xmlns:w16="http://schemas.microsoft.com/office/word/2018/wordml" xmlns:w16du="http://schemas.microsoft.com/office/word/2023/wordml/word16du" xmlns:w16sdtdh="http://schemas.microsoft.com/office/word/2020/wordml/sdtdatahash" xmlns:w16sdtfl="http://schemas.microsoft.com/office/word/2024/wordml/sdtformatlock" xmlns:w16se="http://schemas.microsoft.com/office/word/2015/wordml/symex" xmlns:wpg="http://schemas.microsoft.com/office/word/2010/wordprocessingGroup" xmlns:wpi="http://schemas.microsoft.com/office/word/2010/wordprocessingInk" xmlns:wne="http://schemas.microsoft.com/office/word/2006/wordml" xmlns:wps="http://schemas.microsoft.com/office/word/2010/wordprocessingShape" mc:Ignorable="w14 w15 w16se w16cid w16 w16cex w16sdtdh w16sdtfl w16du wp14">
+<w:ftr xmlns:wpc="http://schemas.microsoft.com/office/word/2010/wordprocessingCanvas" xmlns:cx="http://schemas.microsoft.com/office/drawing/2014/chartex" xmlns:cx1="http://schemas.microsoft.com/office/drawing/2015/9/8/chartex" xmlns:cx2="http://schemas.microsoft.com/office/drawing/2015/10/21/chartex" xmlns:cx3="http://schemas.microsoft.com/office/drawing/2016/5/9/chartex" xmlns:cx4="http://schemas.microsoft.com/office/drawing/2016/5/10/chartex" xmlns:cx5="http://schemas.microsoft.com/office/drawing/2016/5/11/chartex" xmlns:cx6="http://schemas.microsoft.com/office/drawing/2016/5/12/chartex" xmlns:cx7="http://schemas.microsoft.com/office/drawing/2016/5/13/chartex" xmlns:cx8="http://schemas.microsoft.com/office/drawing/2016/5/14/chartex" xmlns:mc="http://schemas.openxmlformats.org/markup-compatibility/2006" xmlns:aink="http://schemas.microsoft.com/office/drawing/2016/ink" xmlns:am3d="http://schemas.microsoft.com/office/drawing/2017/model3d" xmlns:o="urn:schemas-microsoft-com:office:office" xmlns:oel="http://schemas.microsoft.com/office/2019/extlst" xmlns:r="http://schemas.openxmlformats.org/officeDocument/2006/relationships" xmlns:m="http://schemas.openxmlformats.org/officeDocument/2006/math" xmlns:v="urn:schemas-microsoft-com:vml" xmlns:wp14="http://schemas.microsoft.com/office/word/2010/wordprocessingDrawing" xmlns:wp="http://schemas.openxmlformats.org/drawingml/2006/wordprocessingDrawing" xmlns:w10="urn:schemas-microsoft-com:office:word" xmlns:w="http://schemas.openxmlformats.org/wordprocessingml/2006/main" xmlns:w14="http://schemas.microsoft.com/office/word/2010/wordml" xmlns:w15="http://schemas.microsoft.com/office/word/2012/wordml" xmlns:w16cei="http://schemas.microsoft.com/office/word/2026/wordml/cei" xmlns:w16cex="http://schemas.microsoft.com/office/word/2018/wordml/cex" xmlns:w16cid="http://schemas.microsoft.com/office/word/2016/wordml/cid" xmlns:w16="http://schemas.microsoft.com/office/word/2018/wordml" xmlns:w16du="http://schemas.microsoft.com/office/word/2023/wordml/word16du" xmlns:w16sdtdh="http://schemas.microsoft.com/office/word/2020/wordml/sdtdatahash" xmlns:w16sdtfl="http://schemas.microsoft.com/office/word/2024/wordml/sdtformatlock" xmlns:w16se="http://schemas.microsoft.com/office/word/2015/wordml/symex" xmlns:wpg="http://schemas.microsoft.com/office/word/2010/wordprocessingGroup" xmlns:wpi="http://schemas.microsoft.com/office/word/2010/wordprocessingInk" xmlns:wne="http://schemas.microsoft.com/office/word/2006/wordml" xmlns:wps="http://schemas.microsoft.com/office/word/2010/wordprocessingShape" mc:Ignorable="w14 w15 w16se w16cid w16 w16cex w16sdtdh w16sdtfl w16du wp14">
   <w:sdt>
     <w:sdtPr>
       <w:id w:val="-1335842261"/>
@@ -744,7 +744,7 @@
 </file>
 
 <file path=word/footnotes.xml><?xml version="1.0" encoding="utf-8"?>
-<w:footnotes xmlns:wpc="http://schemas.microsoft.com/office/word/2010/wordprocessingCanvas" xmlns:cx="http://schemas.microsoft.com/office/drawing/2014/chartex" xmlns:cx1="http://schemas.microsoft.com/office/drawing/2015/9/8/chartex" xmlns:cx2="http://schemas.microsoft.com/office/drawing/2015/10/21/chartex" xmlns:cx3="http://schemas.microsoft.com/office/drawing/2016/5/9/chartex" xmlns:cx4="http://schemas.microsoft.com/office/drawing/2016/5/10/chartex" xmlns:cx5="http://schemas.microsoft.com/office/drawing/2016/5/11/chartex" xmlns:cx6="http://schemas.microsoft.com/office/drawing/2016/5/12/chartex" xmlns:cx7="http://schemas.microsoft.com/office/drawing/2016/5/13/chartex" xmlns:cx8="http://schemas.microsoft.com/office/drawing/2016/5/14/chartex" xmlns:mc="http://schemas.openxmlformats.org/markup-compatibility/2006" xmlns:aink="http://schemas.microsoft.com/office/drawing/2016/ink" xmlns:am3d="http://schemas.microsoft.com/office/drawing/2017/model3d" xmlns:o="urn:schemas-microsoft-com:office:office" xmlns:oel="http://schemas.microsoft.com/office/2019/extlst" xmlns:r="http://schemas.openxmlformats.org/officeDocument/2006/relationships" xmlns:m="http://schemas.openxmlformats.org/officeDocument/2006/math" xmlns:v="urn:schemas-microsoft-com:vml" xmlns:wp14="http://schemas.microsoft.com/office/word/2010/wordprocessingDrawing" xmlns:wp="http://schemas.openxmlformats.org/drawingml/2006/wordprocessingDrawing" xmlns:w10="urn:schemas-microsoft-com:office:word" xmlns:w="http://schemas.openxmlformats.org/wordprocessingml/2006/main" xmlns:w14="http://schemas.microsoft.com/office/word/2010/wordml" xmlns:w15="http://schemas.microsoft.com/office/word/2012/wordml" xmlns:w16cex="http://schemas.microsoft.com/office/word/2018/wordml/cex" xmlns:w16cid="http://schemas.microsoft.com/office/word/2016/wordml/cid" xmlns:w16="http://schemas.microsoft.com/office/word/2018/wordml" xmlns:w16du="http://schemas.microsoft.com/office/word/2023/wordml/word16du" xmlns:w16sdtdh="http://schemas.microsoft.com/office/word/2020/wordml/sdtdatahash" xmlns:w16sdtfl="http://schemas.microsoft.com/office/word/2024/wordml/sdtformatlock" xmlns:w16se="http://schemas.microsoft.com/office/word/2015/wordml/symex" xmlns:wpg="http://schemas.microsoft.com/office/word/2010/wordprocessingGroup" xmlns:wpi="http://schemas.microsoft.com/office/word/2010/wordprocessingInk" xmlns:wne="http://schemas.microsoft.com/office/word/2006/wordml" xmlns:wps="http://schemas.microsoft.com/office/word/2010/wordprocessingShape" mc:Ignorable="w14 w15 w16se w16cid w16 w16cex w16sdtdh w16sdtfl w16du wp14">
+<w:footnotes xmlns:wpc="http://schemas.microsoft.com/office/word/2010/wordprocessingCanvas" xmlns:cx="http://schemas.microsoft.com/office/drawing/2014/chartex" xmlns:cx1="http://schemas.microsoft.com/office/drawing/2015/9/8/chartex" xmlns:cx2="http://schemas.microsoft.com/office/drawing/2015/10/21/chartex" xmlns:cx3="http://schemas.microsoft.com/office/drawing/2016/5/9/chartex" xmlns:cx4="http://schemas.microsoft.com/office/drawing/2016/5/10/chartex" xmlns:cx5="http://schemas.microsoft.com/office/drawing/2016/5/11/chartex" xmlns:cx6="http://schemas.microsoft.com/office/drawing/2016/5/12/chartex" xmlns:cx7="http://schemas.microsoft.com/office/drawing/2016/5/13/chartex" xmlns:cx8="http://schemas.microsoft.com/office/drawing/2016/5/14/chartex" xmlns:mc="http://schemas.openxmlformats.org/markup-compatibility/2006" xmlns:aink="http://schemas.microsoft.com/office/drawing/2016/ink" xmlns:am3d="http://schemas.microsoft.com/office/drawing/2017/model3d" xmlns:o="urn:schemas-microsoft-com:office:office" xmlns:oel="http://schemas.microsoft.com/office/2019/extlst" xmlns:r="http://schemas.openxmlformats.org/officeDocument/2006/relationships" xmlns:m="http://schemas.openxmlformats.org/officeDocument/2006/math" xmlns:v="urn:schemas-microsoft-com:vml" xmlns:wp14="http://schemas.microsoft.com/office/word/2010/wordprocessingDrawing" xmlns:wp="http://schemas.openxmlformats.org/drawingml/2006/wordprocessingDrawing" xmlns:w10="urn:schemas-microsoft-com:office:word" xmlns:w="http://schemas.openxmlformats.org/wordprocessingml/2006/main" xmlns:w14="http://schemas.microsoft.com/office/word/2010/wordml" xmlns:w15="http://schemas.microsoft.com/office/word/2012/wordml" xmlns:w16cei="http://schemas.microsoft.com/office/word/2026/wordml/cei" xmlns:w16cex="http://schemas.microsoft.com/office/word/2018/wordml/cex" xmlns:w16cid="http://schemas.microsoft.com/office/word/2016/wordml/cid" xmlns:w16="http://schemas.microsoft.com/office/word/2018/wordml" xmlns:w16du="http://schemas.microsoft.com/office/word/2023/wordml/word16du" xmlns:w16sdtdh="http://schemas.microsoft.com/office/word/2020/wordml/sdtdatahash" xmlns:w16sdtfl="http://schemas.microsoft.com/office/word/2024/wordml/sdtformatlock" xmlns:w16se="http://schemas.microsoft.com/office/word/2015/wordml/symex" xmlns:wpg="http://schemas.microsoft.com/office/word/2010/wordprocessingGroup" xmlns:wpi="http://schemas.microsoft.com/office/word/2010/wordprocessingInk" xmlns:wne="http://schemas.microsoft.com/office/word/2006/wordml" xmlns:wps="http://schemas.microsoft.com/office/word/2010/wordprocessingShape" mc:Ignorable="w14 w15 w16se w16cid w16 w16cex w16sdtdh w16sdtfl w16du wp14">
   <w:footnote w:type="separator" w:id="-1">
     <w:p>
       <w:pPr>
@@ -769,7 +769,7 @@
 </file>
 
 <file path=word/numbering.xml><?xml version="1.0" encoding="utf-8"?>
-<w:numbering xmlns:wpc="http://schemas.microsoft.com/office/word/2010/wordprocessingCanvas" xmlns:cx="http://schemas.microsoft.com/office/drawing/2014/chartex" xmlns:cx1="http://schemas.microsoft.com/office/drawing/2015/9/8/chartex" xmlns:cx2="http://schemas.microsoft.com/office/drawing/2015/10/21/chartex" xmlns:cx3="http://schemas.microsoft.com/office/drawing/2016/5/9/chartex" xmlns:cx4="http://schemas.microsoft.com/office/drawing/2016/5/10/chartex" xmlns:cx5="http://schemas.microsoft.com/office/drawing/2016/5/11/chartex" xmlns:cx6="http://schemas.microsoft.com/office/drawing/2016/5/12/chartex" xmlns:cx7="http://schemas.microsoft.com/office/drawing/2016/5/13/chartex" xmlns:cx8="http://schemas.microsoft.com/office/drawing/2016/5/14/chartex" xmlns:mc="http://schemas.openxmlformats.org/markup-compatibility/2006" xmlns:aink="http://schemas.microsoft.com/office/drawing/2016/ink" xmlns:am3d="http://schemas.microsoft.com/office/drawing/2017/model3d" xmlns:o="urn:schemas-microsoft-com:office:office" xmlns:oel="http://schemas.microsoft.com/office/2019/extlst" xmlns:r="http://schemas.openxmlformats.org/officeDocument/2006/relationships" xmlns:m="http://schemas.openxmlformats.org/officeDocument/2006/math" xmlns:v="urn:schemas-microsoft-com:vml" xmlns:wp14="http://schemas.microsoft.com/office/word/2010/wordprocessingDrawing" xmlns:wp="http://schemas.openxmlformats.org/drawingml/2006/wordprocessingDrawing" xmlns:w10="urn:schemas-microsoft-com:office:word" xmlns:w="http://schemas.openxmlformats.org/wordprocessingml/2006/main" xmlns:w14="http://schemas.microsoft.com/office/word/2010/wordml" xmlns:w15="http://schemas.microsoft.com/office/word/2012/wordml" xmlns:w16cex="http://schemas.microsoft.com/office/word/2018/wordml/cex" xmlns:w16cid="http://schemas.microsoft.com/office/word/2016/wordml/cid" xmlns:w16="http://schemas.microsoft.com/office/word/2018/wordml" xmlns:w16du="http://schemas.microsoft.com/office/word/2023/wordml/word16du" xmlns:w16sdtdh="http://schemas.microsoft.com/office/word/2020/wordml/sdtdatahash" xmlns:w16sdtfl="http://schemas.microsoft.com/office/word/2024/wordml/sdtformatlock" xmlns:w16se="http://schemas.microsoft.com/office/word/2015/wordml/symex" xmlns:wpg="http://schemas.microsoft.com/office/word/2010/wordprocessingGroup" xmlns:wpi="http://schemas.microsoft.com/office/word/2010/wordprocessingInk" xmlns:wne="http://schemas.microsoft.com/office/word/2006/wordml" xmlns:wps="http://schemas.microsoft.com/office/word/2010/wordprocessingShape" mc:Ignorable="w14 w15 w16se w16cid w16 w16cex w16sdtdh w16sdtfl w16du wp14">
+<w:numbering xmlns:wpc="http://schemas.microsoft.com/office/word/2010/wordprocessingCanvas" xmlns:cx="http://schemas.microsoft.com/office/drawing/2014/chartex" xmlns:cx1="http://schemas.microsoft.com/office/drawing/2015/9/8/chartex" xmlns:cx2="http://schemas.microsoft.com/office/drawing/2015/10/21/chartex" xmlns:cx3="http://schemas.microsoft.com/office/drawing/2016/5/9/chartex" xmlns:cx4="http://schemas.microsoft.com/office/drawing/2016/5/10/chartex" xmlns:cx5="http://schemas.microsoft.com/office/drawing/2016/5/11/chartex" xmlns:cx6="http://schemas.microsoft.com/office/drawing/2016/5/12/chartex" xmlns:cx7="http://schemas.microsoft.com/office/drawing/2016/5/13/chartex" xmlns:cx8="http://schemas.microsoft.com/office/drawing/2016/5/14/chartex" xmlns:mc="http://schemas.openxmlformats.org/markup-compatibility/2006" xmlns:aink="http://schemas.microsoft.com/office/drawing/2016/ink" xmlns:am3d="http://schemas.microsoft.com/office/drawing/2017/model3d" xmlns:o="urn:schemas-microsoft-com:office:office" xmlns:oel="http://schemas.microsoft.com/office/2019/extlst" xmlns:r="http://schemas.openxmlformats.org/officeDocument/2006/relationships" xmlns:m="http://schemas.openxmlformats.org/officeDocument/2006/math" xmlns:v="urn:schemas-microsoft-com:vml" xmlns:wp14="http://schemas.microsoft.com/office/word/2010/wordprocessingDrawing" xmlns:wp="http://schemas.openxmlformats.org/drawingml/2006/wordprocessingDrawing" xmlns:w10="urn:schemas-microsoft-com:office:word" xmlns:w="http://schemas.openxmlformats.org/wordprocessingml/2006/main" xmlns:w14="http://schemas.microsoft.com/office/word/2010/wordml" xmlns:w15="http://schemas.microsoft.com/office/word/2012/wordml" xmlns:w16cei="http://schemas.microsoft.com/office/word/2026/wordml/cei" xmlns:w16cex="http://schemas.microsoft.com/office/word/2018/wordml/cex" xmlns:w16cid="http://schemas.microsoft.com/office/word/2016/wordml/cid" xmlns:w16="http://schemas.microsoft.com/office/word/2018/wordml" xmlns:w16du="http://schemas.microsoft.com/office/word/2023/wordml/word16du" xmlns:w16sdtdh="http://schemas.microsoft.com/office/word/2020/wordml/sdtdatahash" xmlns:w16sdtfl="http://schemas.microsoft.com/office/word/2024/wordml/sdtformatlock" xmlns:w16se="http://schemas.microsoft.com/office/word/2015/wordml/symex" xmlns:wpg="http://schemas.microsoft.com/office/word/2010/wordprocessingGroup" xmlns:wpi="http://schemas.microsoft.com/office/word/2010/wordprocessingInk" xmlns:wne="http://schemas.microsoft.com/office/word/2006/wordml" xmlns:wps="http://schemas.microsoft.com/office/word/2010/wordprocessingShape" mc:Ignorable="w14 w15 w16se w16cid w16 w16cex w16sdtdh w16sdtfl w16du wp14">
   <w:abstractNum w:abstractNumId="0" w15:restartNumberingAfterBreak="0">
     <w:nsid w:val="32B762A0"/>
     <w:multiLevelType w:val="hybridMultilevel"/>
@@ -890,7 +890,7 @@
 </file>
 
 <file path=word/people.xml><?xml version="1.0" encoding="utf-8"?>
-<w15:people xmlns:wpc="http://schemas.microsoft.com/office/word/2010/wordprocessingCanvas" xmlns:cx="http://schemas.microsoft.com/office/drawing/2014/chartex" xmlns:cx1="http://schemas.microsoft.com/office/drawing/2015/9/8/chartex" xmlns:cx2="http://schemas.microsoft.com/office/drawing/2015/10/21/chartex" xmlns:cx3="http://schemas.microsoft.com/office/drawing/2016/5/9/chartex" xmlns:cx4="http://schemas.microsoft.com/office/drawing/2016/5/10/chartex" xmlns:cx5="http://schemas.microsoft.com/office/drawing/2016/5/11/chartex" xmlns:cx6="http://schemas.microsoft.com/office/drawing/2016/5/12/chartex" xmlns:cx7="http://schemas.microsoft.com/office/drawing/2016/5/13/chartex" xmlns:cx8="http://schemas.microsoft.com/office/drawing/2016/5/14/chartex" xmlns:mc="http://schemas.openxmlformats.org/markup-compatibility/2006" xmlns:aink="http://schemas.microsoft.com/office/drawing/2016/ink" xmlns:am3d="http://schemas.microsoft.com/office/drawing/2017/model3d" xmlns:o="urn:schemas-microsoft-com:office:office" xmlns:oel="http://schemas.microsoft.com/office/2019/extlst" xmlns:r="http://schemas.openxmlformats.org/officeDocument/2006/relationships" xmlns:m="http://schemas.openxmlformats.org/officeDocument/2006/math" xmlns:v="urn:schemas-microsoft-com:vml" xmlns:wp14="http://schemas.microsoft.com/office/word/2010/wordprocessingDrawing" xmlns:wp="http://schemas.openxmlformats.org/drawingml/2006/wordprocessingDrawing" xmlns:w10="urn:schemas-microsoft-com:office:word" xmlns:w="http://schemas.openxmlformats.org/wordprocessingml/2006/main" xmlns:w14="http://schemas.microsoft.com/office/word/2010/wordml" xmlns:w15="http://schemas.microsoft.com/office/word/2012/wordml" xmlns:w16cex="http://schemas.microsoft.com/office/word/2018/wordml/cex" xmlns:w16cid="http://schemas.microsoft.com/office/word/2016/wordml/cid" xmlns:w16="http://schemas.microsoft.com/office/word/2018/wordml" xmlns:w16du="http://schemas.microsoft.com/office/word/2023/wordml/word16du" xmlns:w16sdtdh="http://schemas.microsoft.com/office/word/2020/wordml/sdtdatahash" xmlns:w16sdtfl="http://schemas.microsoft.com/office/word/2024/wordml/sdtformatlock" xmlns:w16se="http://schemas.microsoft.com/office/word/2015/wordml/symex" xmlns:wpg="http://schemas.microsoft.com/office/word/2010/wordprocessingGroup" xmlns:wpi="http://schemas.microsoft.com/office/word/2010/wordprocessingInk" xmlns:wne="http://schemas.microsoft.com/office/word/2006/wordml" xmlns:wps="http://schemas.microsoft.com/office/word/2010/wordprocessingShape" mc:Ignorable="w14 w15 w16se w16cid w16 w16cex w16sdtdh w16sdtfl w16du wp14">
+<w15:people xmlns:wpc="http://schemas.microsoft.com/office/word/2010/wordprocessingCanvas" xmlns:cx="http://schemas.microsoft.com/office/drawing/2014/chartex" xmlns:cx1="http://schemas.microsoft.com/office/drawing/2015/9/8/chartex" xmlns:cx2="http://schemas.microsoft.com/office/drawing/2015/10/21/chartex" xmlns:cx3="http://schemas.microsoft.com/office/drawing/2016/5/9/chartex" xmlns:cx4="http://schemas.microsoft.com/office/drawing/2016/5/10/chartex" xmlns:cx5="http://schemas.microsoft.com/office/drawing/2016/5/11/chartex" xmlns:cx6="http://schemas.microsoft.com/office/drawing/2016/5/12/chartex" xmlns:cx7="http://schemas.microsoft.com/office/drawing/2016/5/13/chartex" xmlns:cx8="http://schemas.microsoft.com/office/drawing/2016/5/14/chartex" xmlns:mc="http://schemas.openxmlformats.org/markup-compatibility/2006" xmlns:aink="http://schemas.microsoft.com/office/drawing/2016/ink" xmlns:am3d="http://schemas.microsoft.com/office/drawing/2017/model3d" xmlns:o="urn:schemas-microsoft-com:office:office" xmlns:oel="http://schemas.microsoft.com/office/2019/extlst" xmlns:r="http://schemas.openxmlformats.org/officeDocument/2006/relationships" xmlns:m="http://schemas.openxmlformats.org/officeDocument/2006/math" xmlns:v="urn:schemas-microsoft-com:vml" xmlns:wp14="http://schemas.microsoft.com/office/word/2010/wordprocessingDrawing" xmlns:wp="http://schemas.openxmlformats.org/drawingml/2006/wordprocessingDrawing" xmlns:w10="urn:schemas-microsoft-com:office:word" xmlns:w="http://schemas.openxmlformats.org/wordprocessingml/2006/main" xmlns:w14="http://schemas.microsoft.com/office/word/2010/wordml" xmlns:w15="http://schemas.microsoft.com/office/word/2012/wordml" xmlns:w16cei="http://schemas.microsoft.com/office/word/2026/wordml/cei" xmlns:w16cex="http://schemas.microsoft.com/office/word/2018/wordml/cex" xmlns:w16cid="http://schemas.microsoft.com/office/word/2016/wordml/cid" xmlns:w16="http://schemas.microsoft.com/office/word/2018/wordml" xmlns:w16du="http://schemas.microsoft.com/office/word/2023/wordml/word16du" xmlns:w16sdtdh="http://schemas.microsoft.com/office/word/2020/wordml/sdtdatahash" xmlns:w16sdtfl="http://schemas.microsoft.com/office/word/2024/wordml/sdtformatlock" xmlns:w16se="http://schemas.microsoft.com/office/word/2015/wordml/symex" xmlns:wpg="http://schemas.microsoft.com/office/word/2010/wordprocessingGroup" xmlns:wpi="http://schemas.microsoft.com/office/word/2010/wordprocessingInk" xmlns:wne="http://schemas.microsoft.com/office/word/2006/wordml" xmlns:wps="http://schemas.microsoft.com/office/word/2010/wordprocessingShape" mc:Ignorable="w14 w15 w16se w16cid w16 w16cex w16sdtdh w16sdtfl w16du wp14">
   <w15:person w15:author="Stephen Richard">
     <w15:presenceInfo w15:providerId="Windows Live" w15:userId="944a82e2ddcde9eb"/>
   </w15:person>

</xml_diff>